<commit_message>
docs: record measurement production verification
</commit_message>
<xml_diff>
--- a/docs/seo-runs/2026-09-09/Text2Task_SEO_GEO_Run_2026-09-09.docx
+++ b/docs/seo-runs/2026-09-09/Text2Task_SEO_GEO_Run_2026-09-09.docx
@@ -73,7 +73,7 @@
     </w:p>
     <w:p>
       <w:r>
-        <w:t xml:space="preserve">PHASE 1 IMPLEMENTATION: MILESTONE 1 PREVIEW VERIFIED / OWNER APPROVED FOR MERGE</w:t>
+        <w:t xml:space="preserve">PHASE 1 IMPLEMENTATION: MILESTONE 1 PRODUCTION DEPLOYED / PRODUCTION SMOKE VERIFIED / COMPLETE</w:t>
       </w:r>
     </w:p>
     <w:p>
@@ -103,7 +103,7 @@
     </w:p>
     <w:p>
       <w:r>
-        <w:t xml:space="preserve">Phase 1 Milestone 1 implementation changed application code and tests on branch feat/seo-measurement-foundation. The current pre-merge Preview verification gate records documentation-only evidence. No database schema, migration, environment variable, Vercel configuration, Google/Bing/Supabase production setting, production service, merge, manual production deploy, or production change was performed.</w:t>
+        <w:t xml:space="preserve">Phase 1 Milestone 1 implementation changed application code and tests through PR #2. The implementation PR has now been merged to main and deployed by Vercel Production. The current closeout update records documentation-only evidence. No database schema, migration, environment variable, Vercel configuration, Google/Bing/Supabase production setting, manual production deploy, or production configuration change was performed by this documentation task.</w:t>
       </w:r>
     </w:p>
     <w:p>
@@ -193,17 +193,27 @@
     </w:p>
     <w:p>
       <w:r>
-        <w:t xml:space="preserve">Phase 1 Milestone 1 update recorded 2026-09-13 15:12:33 Asia/Jerusalem and correction pass recorded 2026-09-13 16:55:06 Asia/Jerusalem: Measurement Foundation was implemented locally on branch feat/seo-measurement-foundation from baseline commit 92050bd1d21111192157bd3b8305861fb9208192, then corrected after the pre-commit owner review gate. The local implementation adds production-grade, server-authoritative, idempotent first_extract_created, project_saved, and paid_conversion analytics using the existing analytics_events pipeline. No database migration was required. Local tests/typecheck/changed-file lint/build completed as recorded in §40. Production verification has not started.</w:t>
-      </w:r>
-    </w:p>
-    <w:p>
-      <w:r>
-        <w:t xml:space="preserve"/>
-      </w:r>
-    </w:p>
-    <w:p>
-      <w:r>
-        <w:t xml:space="preserve">Pre-merge Preview verification update recorded 2026-09-13 18:59:27 Asia/Jerusalem: PR #2 (Phase 1: add SEO funnel measurement foundation) exists for implementation commit 10846aa0c9dfc7a2f6a2a215374d75eb6a5103f6, and Vercel created a READY Preview deployment for branch feat/seo-measurement-foundation. Owner-verified Vercel environment isolation confirmed Preview uses the separate text2task-staging Supabase project, not Production Supabase. Preview/Staging runtime checks passed for first text extraction, first_extract_created, first project save / project_saved, and second-extraction deduplication. Manual image extraction runtime verification was deferred by owner as non-blocking. Manual paid_conversion runtime verification was deferred pending a safe Creem verification strategy. Milestone 1 is preview verified and owner approved for merge review; production verification has not started.</w:t>
+        <w:t xml:space="preserve">Phase 1 Milestone 1 update recorded 2026-09-13 15:12:33 Asia/Jerusalem and correction pass recorded 2026-09-13 16:55:06 Asia/Jerusalem: Measurement Foundation was implemented locally on branch feat/seo-measurement-foundation from baseline commit 92050bd1d21111192157bd3b8305861fb9208192, then corrected after the pre-commit owner review gate. The local implementation added production-grade, server-authoritative, idempotent first_extract_created, project_saved, and paid_conversion analytics using the existing analytics_events pipeline. No database migration was required. Local tests/typecheck/changed-file lint/build completed as recorded in §40. At that time, production verification had not started.</w:t>
+      </w:r>
+    </w:p>
+    <w:p>
+      <w:r>
+        <w:t xml:space="preserve"/>
+      </w:r>
+    </w:p>
+    <w:p>
+      <w:r>
+        <w:t xml:space="preserve">Pre-merge Preview verification update recorded 2026-09-13 18:59:27 Asia/Jerusalem: PR #2 (Phase 1: add SEO funnel measurement foundation) existed for implementation commit 10846aa0c9dfc7a2f6a2a215374d75eb6a5103f6, and Vercel created a READY Preview deployment for branch feat/seo-measurement-foundation. Owner-verified Vercel environment isolation confirmed Preview used the separate text2task-staging Supabase project, not Production Supabase. Preview/Staging runtime checks passed for first text extraction, first_extract_created, first project save / project_saved, and second-extraction deduplication. Manual image extraction runtime verification was deferred by owner as non-blocking. Manual paid_conversion runtime verification was deferred pending a safe Creem verification strategy. At that gate, Milestone 1 was preview verified and owner approved for merge review; production verification had not started.</w:t>
+      </w:r>
+    </w:p>
+    <w:p>
+      <w:r>
+        <w:t xml:space="preserve"/>
+      </w:r>
+    </w:p>
+    <w:p>
+      <w:r>
+        <w:t xml:space="preserve">Production closeout update recorded 2026-09-14 11:58:23 Asia/Jerusalem: PR #2 (Phase 1: add SEO funnel measurement foundation) was merged successfully to main as merge commit b3e372c. Vercel Production deployment for environment Production, branch main, commit b3e372c reached READY. The owner manually performed a post-deployment production smoke test on https://www.text2task.com/ and verified Homepage, Dashboard, Extract, Tasks, and Calendar load and function normally. Result: PASS — no user-visible regression observed. Manual Production Image Extract runtime verification, manual Production paid_conversion verification, production paid_conversion row verification, production first_extract_created re-verification, and production project_saved re-verification were not performed in this production gate. Image Extract manual runtime remains DEFERRED / NON-BLOCKING. paid_conversion manual runtime remains DEFERRED / SAFE VERIFICATION REQUIRED.</w:t>
       </w:r>
     </w:p>
     <w:p>
@@ -461,7 +471,7 @@
           </w:tcPr>
           <w:p>
             <w:r>
-              <w:t xml:space="preserve">MILESTONE 1 PREVIEW VERIFIED / OWNER APPROVED FOR MERGE</w:t>
+              <w:t xml:space="preserve">MILESTONE 1 PRODUCTION DEPLOYED / PRODUCTION SMOKE VERIFIED / COMPLETE</w:t>
             </w:r>
           </w:p>
         </w:tc>
@@ -571,7 +581,7 @@
           </w:tcPr>
           <w:p>
             <w:r>
-              <w:t xml:space="preserve">YES — local Phase 1 Milestone 1 branch only</w:t>
+              <w:t xml:space="preserve">YES — Phase 1 Milestone 1 implementation</w:t>
             </w:r>
           </w:p>
         </w:tc>
@@ -593,7 +603,7 @@
           </w:tcPr>
           <w:p>
             <w:r>
-              <w:t xml:space="preserve">NO</w:t>
+              <w:t xml:space="preserve">YES — PR #2 merged and Vercel Production deployed before this documentation closeout; this documentation task changed no Production configuration</w:t>
             </w:r>
           </w:p>
         </w:tc>
@@ -615,7 +625,7 @@
           </w:tcPr>
           <w:p>
             <w:r>
-              <w:t xml:space="preserve">Feature-branch commits/pushes only; no merge or Production deploy</w:t>
+              <w:t xml:space="preserve">PR #2 merge and automatic Vercel Production deployment already occurred; this documentation task creates/pushes docs branch only and performs no manual deploy</w:t>
             </w:r>
           </w:p>
         </w:tc>
@@ -681,7 +691,7 @@
     </w:p>
     <w:p>
       <w:r>
-        <w:t xml:space="preserve">3. The acquisition funnel had a real measurement blocker past signup, and Phase 1 Milestone 1 has now closed the P0 implementation portion through Preview/Staging verification: the P0 measurement items are paid_conversion from the authoritative Creem confirmed-payment webhook path, first_extract_created, and project_saved. email_confirmed remains P1. client_update_created and client_update_applied remain P2/product analytics. Production row verification is still required before the new funnel data is trusted operationally.</w:t>
+        <w:t xml:space="preserve">3. The acquisition funnel had a real measurement blocker past signup, and Phase 1 Milestone 1 is now production deployed and production smoke verified: the P0 measurement items are paid_conversion from the authoritative Creem confirmed-payment webhook path, first_extract_created, and project_saved. email_confirmed remains P1. client_update_created and client_update_applied remain P2/product analytics. Production event-row re-verification was not performed in the production smoke gate, and paid_conversion manual runtime verification still requires a safe Creem strategy.</w:t>
       </w:r>
     </w:p>
     <w:p>
@@ -731,7 +741,7 @@
     </w:p>
     <w:p>
       <w:r>
-        <w:t xml:space="preserve">No P0 finding in this audit is a live security breach, a broken redirect, or an actual indexing catastrophe — the sitemap/robots/canonical/admin-auth architecture is sound. At Phase 0, the confirmed P0s were the founder/entity-disambiguation decision and the core measurement blockers (paid_conversion, first_extract_created, project_saved), rather than "the site is currently broken." Phase 1 Milestone 1 is now preview verified and owner approved for merge review; production verification has not started.</w:t>
+        <w:t xml:space="preserve">No P0 finding in this audit is a live security breach, a broken redirect, or an actual indexing catastrophe — the sitemap/robots/canonical/admin-auth architecture is sound. At Phase 0, the confirmed P0s were the founder/entity-disambiguation decision and the core measurement blockers (paid_conversion, first_extract_created, project_saved), rather than "the site is currently broken." Phase 1 Milestone 1 is now production deployed, production smoke verified, and complete, with the explicitly deferred runtime follow-ups preserved.</w:t>
       </w:r>
     </w:p>
     <w:p>
@@ -5220,7 +5230,7 @@
           </w:tcPr>
           <w:p>
             <w:r>
-              <w:t xml:space="preserve">Phase 0 finding: NOT FOUND — allowlisted, never emitted. Phase 1 Milestone 1: PREVIEW VERIFIED / OWNER APPROVED FOR MERGE (§40, D019).</w:t>
+              <w:t xml:space="preserve">Phase 0 finding: NOT FOUND — allowlisted, never emitted. Phase 1 Milestone 1: PRODUCTION DEPLOYED / PRODUCTION SMOKE VERIFIED / COMPLETE; production event-row re-verification was not performed in this gate (§40, D020).</w:t>
             </w:r>
           </w:p>
         </w:tc>
@@ -5252,7 +5262,7 @@
           </w:tcPr>
           <w:p>
             <w:r>
-              <w:t xml:space="preserve">Phase 0 finding: NOT FOUND — allowlisted, never emitted. Phase 1 Milestone 1: PREVIEW VERIFIED / OWNER APPROVED FOR MERGE (§40, D019).</w:t>
+              <w:t xml:space="preserve">Phase 0 finding: NOT FOUND — allowlisted, never emitted. Phase 1 Milestone 1: PRODUCTION DEPLOYED / PRODUCTION SMOKE VERIFIED / COMPLETE; production event-row re-verification was not performed in this gate (§40, D020).</w:t>
             </w:r>
           </w:p>
         </w:tc>
@@ -5316,17 +5326,17 @@
           </w:tcPr>
           <w:p>
             <w:r>
-              <w:t xml:space="preserve">Phase 0 finding: NOT FOUND in the internal table at all. Phase 1 Milestone 1: IMPLEMENTED LOCALLY WITH AUTOMATED COVERAGE; MANUAL RUNTIME DEFERRED PENDING SAFE CREEM STRATEGY (§40, D019).</w:t>
-            </w:r>
-          </w:p>
-        </w:tc>
-        <w:tc>
-          <w:tcPr>
-            <w:tcW w:w="0" w:type="auto"/>
-          </w:tcPr>
-          <w:p>
-            <w:r>
-              <w:t xml:space="preserve">paid_conversion now emits from the verified Creem subscription.paid webhook path after authoritative processing; no production verification yet</w:t>
+              <w:t xml:space="preserve">Phase 0 finding: NOT FOUND in the internal table at all. Phase 1 Milestone 1: PRODUCTION DEPLOYED WITH AUTOMATED COVERAGE; MANUAL RUNTIME AND PRODUCTION ROW VERIFICATION DEFERRED PENDING SAFE CREEM STRATEGY (§40, D020).</w:t>
+            </w:r>
+          </w:p>
+        </w:tc>
+        <w:tc>
+          <w:tcPr>
+            <w:tcW w:w="0" w:type="auto"/>
+          </w:tcPr>
+          <w:p>
+            <w:r>
+              <w:t xml:space="preserve">paid_conversion now emits from the verified Creem subscription.paid webhook path after authoritative processing; manual runtime/row verification remains deferred</w:t>
             </w:r>
           </w:p>
         </w:tc>
@@ -5359,7 +5369,7 @@
     </w:p>
     <w:p>
       <w:r>
-        <w:t xml:space="preserve">Confirmed measurement priority classification (owner-reviewed): the acquisition funnel is real and complete through signup, but priority is not flat across all missing events. P0 measurement items are paid_conversion (from the authoritative Creem confirmed-payment webhook path, implemented production-grade and idempotently), first_extract_created, and project_saved. P1 is email_confirmed. P2/product analytics are client_update_created and client_update_applied. Phase 1 Milestone 1 is preview verified and owner approved for merge review; the remaining gap is production row verification after a future authorized merge/deploy.</w:t>
+        <w:t xml:space="preserve">Confirmed measurement priority classification (owner-reviewed): the acquisition funnel is real and complete through signup, but priority is not flat across all missing events. P0 measurement items are paid_conversion (from the authoritative Creem confirmed-payment webhook path, implemented production-grade and idempotently), first_extract_created, and project_saved. P1 is email_confirmed. P2/product analytics are client_update_created and client_update_applied. Phase 1 Milestone 1 is production deployed and production smoke verified; production event-row re-verification was not performed in this gate, and paid_conversion manual runtime verification remains deferred pending a safe Creem strategy.</w:t>
       </w:r>
     </w:p>
     <w:p>
@@ -9128,7 +9138,7 @@
     </w:p>
     <w:p>
       <w:r>
-        <w:t xml:space="preserve">2. Core P0 measurement was incomplete at Phase 0 and is now preview verified in Phase 1 Milestone 1: no reliable paid_conversion signal existed from the authoritative Creem confirmed-payment webhook path, and first_extract_created / project_saved were allowlisted but never emitted. The implementation now exists, Preview/Staging verification has passed for first_extract_created and project_saved, and manual paid_conversion runtime verification is deferred pending a safe Creem strategy. Future production verification is still required. (§22, §40, D019)</w:t>
+        <w:t xml:space="preserve">2. Core P0 measurement was incomplete at Phase 0 and is now production deployed / production smoke verified in Phase 1 Milestone 1: no reliable paid_conversion signal existed from the authoritative Creem confirmed-payment webhook path, and first_extract_created / project_saved were allowlisted but never emitted. The implementation now exists, Preview/Staging verification passed for first_extract_created and project_saved, PR #2 was merged, and Vercel Production is READY at merge commit b3e372c. Manual Production Image Extract runtime verification, manual Production paid_conversion verification, and production event-row re-verification were not performed in this gate. (§22, §40, D020)</w:t>
       </w:r>
     </w:p>
     <w:p>
@@ -9412,12 +9422,12 @@
     </w:p>
     <w:p>
       <w:r>
-        <w:t xml:space="preserve">Resolved in Phase 1 Milestone 1 through Preview/Staging verification, awaiting production verification:</w:t>
-      </w:r>
-    </w:p>
-    <w:p>
-      <w:r>
-        <w:t xml:space="preserve">- P0 Measurement Foundation implementation is PREVIEW VERIFIED / OWNER APPROVED FOR MERGE for first_extract_created and project_saved, with paid_conversion implemented and covered by automated tests but manual runtime verification deferred pending a safe Creem strategy. No production analytics rows have been verified yet because production verification has not started. (§40, D019)</w:t>
+        <w:t xml:space="preserve">Resolved in Phase 1 Milestone 1 through production deployment and production smoke verification:</w:t>
+      </w:r>
+    </w:p>
+    <w:p>
+      <w:r>
+        <w:t xml:space="preserve">- P0 Measurement Foundation implementation is PRODUCTION DEPLOYED / PRODUCTION SMOKE VERIFIED / COMPLETE. PR #2 was merged to main as b3e372c, Vercel Production is READY for main / b3e372c, and the owner smoke-tested Homepage, Dashboard, Extract, Tasks, and Calendar successfully. Manual Production Image Extract runtime verification, manual Production paid_conversion verification, production paid_conversion row verification, production first_extract_created re-verification, and production project_saved re-verification were not performed in this gate. (§40, D020)</w:t>
       </w:r>
     </w:p>
     <w:p>
@@ -11259,6 +11269,78 @@
           </w:p>
         </w:tc>
       </w:tr>
+      <w:tr>
+        <w:tc>
+          <w:tcPr>
+            <w:tcW w:w="0" w:type="auto"/>
+          </w:tcPr>
+          <w:p>
+            <w:r>
+              <w:t xml:space="preserve">SEO-2026-09-09-D020</w:t>
+            </w:r>
+          </w:p>
+        </w:tc>
+        <w:tc>
+          <w:tcPr>
+            <w:tcW w:w="0" w:type="auto"/>
+          </w:tcPr>
+          <w:p>
+            <w:r>
+              <w:t xml:space="preserve">2026-09-14 11:58:23 Asia/Jerusalem</w:t>
+            </w:r>
+          </w:p>
+        </w:tc>
+        <w:tc>
+          <w:tcPr>
+            <w:tcW w:w="0" w:type="auto"/>
+          </w:tcPr>
+          <w:p>
+            <w:r>
+              <w:t xml:space="preserve">Close Phase 1 Milestone 1 as production deployed, production smoke verified, and complete, while preserving deferred Image Extract and paid_conversion runtime follow-ups.</w:t>
+            </w:r>
+          </w:p>
+        </w:tc>
+        <w:tc>
+          <w:tcPr>
+            <w:tcW w:w="0" w:type="auto"/>
+          </w:tcPr>
+          <w:p>
+            <w:r>
+              <w:t xml:space="preserve">PR #2 was merged successfully to main as merge commit b3e372c; Vercel Production deployment for environment Production, branch main, commit b3e372c reached READY; owner production smoke testing on https://www.text2task.com/ passed for Homepage, Dashboard, Extract, Tasks, and Calendar with no user-visible regression observed. The production gate did not include manual Production Image Extract runtime verification, manual Production paid_conversion verification, production paid_conversion row verification, production first_extract_created re-verification, or production project_saved re-verification.</w:t>
+            </w:r>
+          </w:p>
+        </w:tc>
+        <w:tc>
+          <w:tcPr>
+            <w:tcW w:w="0" w:type="auto"/>
+          </w:tcPr>
+          <w:p>
+            <w:r>
+              <w:t xml:space="preserve">Owner-supplied merge/deployment facts; owner post-deployment smoke-test report; git reconciliation confirming origin/main and local main contain merge commit b3e372c, implementation commit 10846aa, and preview-verification docs commit b153e8a.</w:t>
+            </w:r>
+          </w:p>
+        </w:tc>
+        <w:tc>
+          <w:tcPr>
+            <w:tcW w:w="0" w:type="auto"/>
+          </w:tcPr>
+          <w:p>
+            <w:r>
+              <w:t xml:space="preserve">Marking Image Extract manual runtime as verified — rejected because it was not performed. Marking paid_conversion runtime or row verification as complete — rejected because it was not performed and still requires a safe Creem strategy. Merging/deploying manually during this documentation task — rejected because the task is documentation-only and the production deployment already existed.</w:t>
+            </w:r>
+          </w:p>
+        </w:tc>
+        <w:tc>
+          <w:tcPr>
+            <w:tcW w:w="0" w:type="auto"/>
+          </w:tcPr>
+          <w:p>
+            <w:r>
+              <w:t xml:space="preserve">Production deployed / production smoke verified / complete</w:t>
+            </w:r>
+          </w:p>
+        </w:tc>
+      </w:tr>
     </w:tbl>
     <w:p>
       <w:r>
@@ -13334,6 +13416,98 @@
           </w:p>
         </w:tc>
       </w:tr>
+      <w:tr>
+        <w:tc>
+          <w:tcPr>
+            <w:tcW w:w="0" w:type="auto"/>
+          </w:tcPr>
+          <w:p>
+            <w:r>
+              <w:t xml:space="preserve">2026-09-14 11:58:23 Asia/Jerusalem</w:t>
+            </w:r>
+          </w:p>
+        </w:tc>
+        <w:tc>
+          <w:tcPr>
+            <w:tcW w:w="0" w:type="auto"/>
+          </w:tcPr>
+          <w:p>
+            <w:r>
+              <w:t xml:space="preserve">Phase 1 Milestone 1 production closeout</w:t>
+            </w:r>
+          </w:p>
+        </w:tc>
+        <w:tc>
+          <w:tcPr>
+            <w:tcW w:w="0" w:type="auto"/>
+          </w:tcPr>
+          <w:p>
+            <w:r>
+              <w:t xml:space="preserve">Merge, Production deployment, and owner production smoke verification recorded</w:t>
+            </w:r>
+          </w:p>
+        </w:tc>
+        <w:tc>
+          <w:tcPr>
+            <w:tcW w:w="0" w:type="auto"/>
+          </w:tcPr>
+          <w:p>
+            <w:r>
+              <w:t xml:space="preserve">Owner-supplied PR #2 merge/deployment facts and production smoke-test report</w:t>
+            </w:r>
+          </w:p>
+        </w:tc>
+        <w:tc>
+          <w:tcPr>
+            <w:tcW w:w="0" w:type="auto"/>
+          </w:tcPr>
+          <w:p>
+            <w:r>
+              <w:t xml:space="preserve">Active run Markdown/DOCX, git branch/status/history only</w:t>
+            </w:r>
+          </w:p>
+        </w:tc>
+        <w:tc>
+          <w:tcPr>
+            <w:tcW w:w="0" w:type="auto"/>
+          </w:tcPr>
+          <w:p>
+            <w:r>
+              <w:t xml:space="preserve">Current run Markdown and DOCX only</w:t>
+            </w:r>
+          </w:p>
+        </w:tc>
+        <w:tc>
+          <w:tcPr>
+            <w:tcW w:w="0" w:type="auto"/>
+          </w:tcPr>
+          <w:p>
+            <w:r>
+              <w:t xml:space="preserve">PR #2 merged successfully; merge commit b3e372c; Vercel Production deployment READY for environment Production, branch main, commit b3e372c; owner production smoke test PASS for Homepage, Dashboard, Extract, Tasks, and Calendar; no user-visible regression observed; Image Extract manual runtime remains deferred / non-blocking; paid_conversion manual runtime remains deferred / safe verification required</w:t>
+            </w:r>
+          </w:p>
+        </w:tc>
+        <w:tc>
+          <w:tcPr>
+            <w:tcW w:w="0" w:type="auto"/>
+          </w:tcPr>
+          <w:p>
+            <w:r>
+              <w:t xml:space="preserve">Git reconciliation confirmed local main fast-forwarded to origin/main at b3e372c; 10846aa and b153e8a are ancestors of main; documentation-only branch used; no application/test/config/database files changed by this task; no manual deploy</w:t>
+            </w:r>
+          </w:p>
+        </w:tc>
+        <w:tc>
+          <w:tcPr>
+            <w:tcW w:w="0" w:type="auto"/>
+          </w:tcPr>
+          <w:p>
+            <w:r>
+              <w:t xml:space="preserve">Production deployed / production smoke verified / complete</w:t>
+            </w:r>
+          </w:p>
+        </w:tc>
+      </w:tr>
     </w:tbl>
     <w:p>
       <w:r>
@@ -13342,7 +13516,7 @@
     </w:p>
     <w:p>
       <w:r>
-        <w:t xml:space="preserve">Phase 1 Milestone 1 has changed application code and tests on feat/seo-measurement-foundation, and the pre-merge Preview verification gate changed only the current run documentation. Application code changed: YES — Phase 1 Milestone 1 branch only. Application/test files changed by this documentation gate: NO. Database changed: NO. Migration required: NO. Environment changed: NO. Vercel configuration changed: NO. Production changed: NO. Google configuration changed: NO. Bing application integration changed: NO. Merge performed: NO. Deploy to Production performed: NO.</w:t>
+        <w:t xml:space="preserve">Phase 1 Milestone 1 has changed application code and tests through PR #2, and the production closeout update changed only the current run documentation. Application code changed: YES — Phase 1 Milestone 1 implementation only. Application/test files changed by this documentation gate: NO. Database changed: NO. Migration required: NO. Environment changed: NO. Vercel configuration changed by this task: NO. Production changed by this task: NO. Google configuration changed: NO. Bing application integration changed: NO. Manual deploy performed: NO.</w:t>
       </w:r>
     </w:p>
     <w:p>
@@ -13478,7 +13652,7 @@
     </w:p>
     <w:p>
       <w:r>
-        <w:t xml:space="preserve">Current Codex update: Phase 1 Milestone 1 is preview verified and owner approved for merge review on feature branch feat/seo-measurement-foundation. The pre-merge Preview verification gate changed only this run documentation. No application/test file, database schema/migration, environment variable, Vercel configuration, Google/Bing/Supabase production setting, production service, merge, manual production deploy, or production change was performed.</w:t>
+        <w:t xml:space="preserve">Current Codex update: Phase 1 Milestone 1 is production deployed, production smoke verified, and complete. The production closeout update changed only this run documentation. No application/test file, database schema/migration, environment variable, Vercel configuration, Google/Bing/Supabase production setting, production service, manual production deploy, or production configuration change was performed by this documentation task.</w:t>
       </w:r>
     </w:p>
     <w:p>
@@ -13651,7 +13825,12 @@
     </w:p>
     <w:p>
       <w:r>
-        <w:t xml:space="preserve">PHASE 1 IMPLEMENTATION: MILESTONE 1 PREVIEW VERIFIED / OWNER APPROVED FOR MERGE</w:t>
+        <w:t xml:space="preserve">PHASE 1 IMPLEMENTATION: MILESTONE 1 PRODUCTION DEPLOYED / PRODUCTION SMOKE VERIFIED / COMPLETE</w:t>
+      </w:r>
+    </w:p>
+    <w:p>
+      <w:r>
+        <w:t xml:space="preserve">PHASE 1 MILESTONE 2: NOT STARTED</w:t>
       </w:r>
     </w:p>
     <w:p>
@@ -13671,17 +13850,17 @@
     </w:p>
     <w:p>
       <w:r>
-        <w:t xml:space="preserve">Phase 0B external baseline completion is complete / owner-reviewed. Phase 1 Milestone 1 is preview verified and owner approved for merge review. Production verification has not started.</w:t>
-      </w:r>
-    </w:p>
-    <w:p>
-      <w:r>
-        <w:t xml:space="preserve"/>
-      </w:r>
-    </w:p>
-    <w:p>
-      <w:r>
-        <w:t xml:space="preserve">Application code changed: YES — Phase 1 Milestone 1 branch only. Database changed: NO. Environment changed: NO. Production changed: NO. Google configuration changed: NO. Bing application integration changed: NO. Merge performed: NO. Deploy to Production performed: NO.</w:t>
+        <w:t xml:space="preserve">Phase 0B external baseline completion is complete / owner-reviewed. Phase 1 Milestone 1 is production deployed, production smoke verified, and complete. Milestone 2 has not started.</w:t>
+      </w:r>
+    </w:p>
+    <w:p>
+      <w:r>
+        <w:t xml:space="preserve"/>
+      </w:r>
+    </w:p>
+    <w:p>
+      <w:r>
+        <w:t xml:space="preserve">Application code changed: YES — Phase 1 Milestone 1 implementation only. Database changed: NO. Environment changed: NO. Production changed by this documentation task: NO. Google configuration changed: NO. Bing application integration changed: NO. Manual deploy performed: NO.</w:t>
       </w:r>
     </w:p>
     <w:p>
@@ -18247,12 +18426,17 @@
     </w:p>
     <w:p>
       <w:r>
-        <w:t xml:space="preserve">- Phase 1 implementation: MILESTONE 1 PREVIEW VERIFIED / OWNER APPROVED FOR MERGE.</w:t>
-      </w:r>
-    </w:p>
-    <w:p>
-      <w:r>
-        <w:t xml:space="preserve">- Application code changed: YES — local branch only.</w:t>
+        <w:t xml:space="preserve">- Phase 1 implementation: MILESTONE 1 PRODUCTION DEPLOYED / PRODUCTION SMOKE VERIFIED / COMPLETE.</w:t>
+      </w:r>
+    </w:p>
+    <w:p>
+      <w:r>
+        <w:t xml:space="preserve">- Milestone 2: NOT STARTED.</w:t>
+      </w:r>
+    </w:p>
+    <w:p>
+      <w:r>
+        <w:t xml:space="preserve">- Application code changed: YES — Phase 1 Milestone 1 implementation.</w:t>
       </w:r>
     </w:p>
     <w:p>
@@ -18267,17 +18451,22 @@
     </w:p>
     <w:p>
       <w:r>
-        <w:t xml:space="preserve">- Production changed: NO.</w:t>
-      </w:r>
-    </w:p>
-    <w:p>
-      <w:r>
-        <w:t xml:space="preserve">- Production verification: NOT STARTED.</w:t>
-      </w:r>
-    </w:p>
-    <w:p>
-      <w:r>
-        <w:t xml:space="preserve">- Merge/deploy to Production performed: NO.</w:t>
+        <w:t xml:space="preserve">- Production deployment: READY at merge commit b3e372c.</w:t>
+      </w:r>
+    </w:p>
+    <w:p>
+      <w:r>
+        <w:t xml:space="preserve">- Production smoke verification: PASS.</w:t>
+      </w:r>
+    </w:p>
+    <w:p>
+      <w:r>
+        <w:t xml:space="preserve">- Production changed by this documentation task: NO.</w:t>
+      </w:r>
+    </w:p>
+    <w:p>
+      <w:r>
+        <w:t xml:space="preserve">- Manual deployment performed by this task: NO.</w:t>
       </w:r>
     </w:p>
     <w:p>
@@ -18310,7 +18499,7 @@
     </w:p>
     <w:p>
       <w:r>
-        <w:t xml:space="preserve">Status: PREVIEW VERIFIED / OWNER APPROVED FOR MERGE.</w:t>
+        <w:t xml:space="preserve">Status: PRODUCTION DEPLOYED / PRODUCTION SMOKE VERIFIED / COMPLETE.</w:t>
       </w:r>
     </w:p>
     <w:p>
@@ -18371,6 +18560,26 @@
     <w:p>
       <w:r>
         <w:t xml:space="preserve">PR: #2, Phase 1: add SEO funnel measurement foundation.</w:t>
+      </w:r>
+    </w:p>
+    <w:p>
+      <w:r>
+        <w:t xml:space="preserve"/>
+      </w:r>
+    </w:p>
+    <w:p>
+      <w:r>
+        <w:t xml:space="preserve">Merge commit on main: b3e372c.</w:t>
+      </w:r>
+    </w:p>
+    <w:p>
+      <w:r>
+        <w:t xml:space="preserve"/>
+      </w:r>
+    </w:p>
+    <w:p>
+      <w:r>
+        <w:t xml:space="preserve">Production deployment: Vercel Production READY for branch main / commit b3e372c.</w:t>
       </w:r>
     </w:p>
     <w:p>
@@ -19210,22 +19419,155 @@
         <w:pStyle w:val="Heading2"/>
       </w:pPr>
       <w:r>
-        <w:t xml:space="preserve">40.8 Remaining Verification / Owner Review</w:t>
-      </w:r>
-    </w:p>
-    <w:p>
-      <w:r>
-        <w:t xml:space="preserve"/>
-      </w:r>
-    </w:p>
-    <w:p>
-      <w:r>
-        <w:t xml:space="preserve">- No production verification was performed because no deploy/production change was authorized.</w:t>
-      </w:r>
-    </w:p>
-    <w:p>
-      <w:r>
-        <w:t xml:space="preserve">- After a future authorized merge/deploy, verify real production analytics_events rows for a test signup/extract/save and a safe Creem test-mode payment before trusting production funnel reporting.</w:t>
+        <w:t xml:space="preserve">40.8 Production Deployment / Smoke Verification</w:t>
+      </w:r>
+    </w:p>
+    <w:p>
+      <w:r>
+        <w:t xml:space="preserve"/>
+      </w:r>
+    </w:p>
+    <w:p>
+      <w:r>
+        <w:t xml:space="preserve">Closeout timestamp: 2026-09-14 11:58:23 Asia/Jerusalem.</w:t>
+      </w:r>
+    </w:p>
+    <w:p>
+      <w:r>
+        <w:t xml:space="preserve"/>
+      </w:r>
+    </w:p>
+    <w:p>
+      <w:r>
+        <w:t xml:space="preserve">Merge status: VERIFIED. PR #2 (Phase 1: add SEO funnel measurement foundation) was merged successfully to main as merge commit b3e372c.</w:t>
+      </w:r>
+    </w:p>
+    <w:p>
+      <w:r>
+        <w:t xml:space="preserve"/>
+      </w:r>
+    </w:p>
+    <w:p>
+      <w:r>
+        <w:t xml:space="preserve">Production deployment: VERIFIED. Vercel Production deployment was READY for environment Production, branch main, commit b3e372c.</w:t>
+      </w:r>
+    </w:p>
+    <w:p>
+      <w:r>
+        <w:t xml:space="preserve"/>
+      </w:r>
+    </w:p>
+    <w:p>
+      <w:r>
+        <w:t xml:space="preserve">Owner production smoke test: PASS. The owner manually tested https://www.text2task.com/ after deployment and verified:</w:t>
+      </w:r>
+    </w:p>
+    <w:p>
+      <w:r>
+        <w:t xml:space="preserve">- Homepage: PASS.</w:t>
+      </w:r>
+    </w:p>
+    <w:p>
+      <w:r>
+        <w:t xml:space="preserve">- Dashboard: PASS.</w:t>
+      </w:r>
+    </w:p>
+    <w:p>
+      <w:r>
+        <w:t xml:space="preserve">- Extract: PASS.</w:t>
+      </w:r>
+    </w:p>
+    <w:p>
+      <w:r>
+        <w:t xml:space="preserve">- Tasks: PASS.</w:t>
+      </w:r>
+    </w:p>
+    <w:p>
+      <w:r>
+        <w:t xml:space="preserve">- Calendar: PASS.</w:t>
+      </w:r>
+    </w:p>
+    <w:p>
+      <w:r>
+        <w:t xml:space="preserve"/>
+      </w:r>
+    </w:p>
+    <w:p>
+      <w:r>
+        <w:t xml:space="preserve">No user-visible regression was observed in this production smoke gate.</w:t>
+      </w:r>
+    </w:p>
+    <w:p>
+      <w:r>
+        <w:t xml:space="preserve"/>
+      </w:r>
+    </w:p>
+    <w:p>
+      <w:r>
+        <w:t xml:space="preserve">Accuracy limits for this gate:</w:t>
+      </w:r>
+    </w:p>
+    <w:p>
+      <w:r>
+        <w:t xml:space="preserve">- Manual Production Image Extract runtime verification was not performed.</w:t>
+      </w:r>
+    </w:p>
+    <w:p>
+      <w:r>
+        <w:t xml:space="preserve">- Manual Production paid_conversion verification was not performed.</w:t>
+      </w:r>
+    </w:p>
+    <w:p>
+      <w:r>
+        <w:t xml:space="preserve">- Production paid_conversion row verification was not performed.</w:t>
+      </w:r>
+    </w:p>
+    <w:p>
+      <w:r>
+        <w:t xml:space="preserve">- Production first_extract_created re-verification was not performed.</w:t>
+      </w:r>
+    </w:p>
+    <w:p>
+      <w:r>
+        <w:t xml:space="preserve">- Production project_saved re-verification was not performed.</w:t>
+      </w:r>
+    </w:p>
+    <w:p>
+      <w:r>
+        <w:t xml:space="preserve"/>
+      </w:r>
+    </w:p>
+    <w:p>
+      <w:r>
+        <w:t xml:space="preserve">Preserved follow-ups:</w:t>
+      </w:r>
+    </w:p>
+    <w:p>
+      <w:r>
+        <w:t xml:space="preserve">- Image Extract manual runtime: DEFERRED / NON-BLOCKING.</w:t>
+      </w:r>
+    </w:p>
+    <w:p>
+      <w:r>
+        <w:t xml:space="preserve">- paid_conversion manual runtime: DEFERRED / SAFE VERIFICATION REQUIRED.</w:t>
+      </w:r>
+    </w:p>
+    <w:p>
+      <w:r>
+        <w:t xml:space="preserve"/>
+      </w:r>
+    </w:p>
+    <w:p>
+      <w:pPr>
+        <w:pStyle w:val="Heading2"/>
+      </w:pPr>
+      <w:r>
+        <w:t xml:space="preserve">40.9 Remaining Verification / Follow-Ups</w:t>
+      </w:r>
+    </w:p>
+    <w:p>
+      <w:r>
+        <w:t xml:space="preserve"/>
       </w:r>
     </w:p>
     <w:p>

</xml_diff>

<commit_message>
docs: record entity disambiguation production verification
</commit_message>
<xml_diff>
--- a/docs/seo-runs/2026-09-09/Text2Task_SEO_GEO_Run_2026-09-09.docx
+++ b/docs/seo-runs/2026-09-09/Text2Task_SEO_GEO_Run_2026-09-09.docx
@@ -76,7 +76,12 @@
     </w:p>
     <w:p>
       <w:r>
-        <w:t xml:space="preserve">PHASE 1 MILESTONE 2: IMPLEMENTED LOCALLY / AWAITING OWNER REVIEW</w:t>
+        <w:t xml:space="preserve">PHASE 1 MILESTONE 2: PRODUCTION DEPLOYED / PRODUCTION SMOKE VERIFIED / COMPLETE</w:t>
+      </w:r>
+    </w:p>
+    <w:p>
+      <w:r>
+        <w:t xml:space="preserve">PHASE 1 MILESTONE 3: NOT STARTED</w:t>
       </w:r>
     </w:p>
     <w:p>
@@ -237,6 +242,16 @@
     <w:p>
       <w:r>
         <w:t xml:space="preserve">Phase 1 Milestone 2 implementation update recorded 2026-09-14 13:56:50 Asia/Jerusalem: the owner made a deliberate privacy decision to keep founder identity private for now. No founder name, no Person schema, no founder metadata, no personal-profile sameAs, and no personal social/profile link were added. Milestone 2 was implemented locally on branch feat/seo-entity-disambiguation by strengthening Text2Task's canonical Organization/product/domain signals only: shared site constants now define the canonical brand name, URL, logo, and description; homepage Organization/WebSite JSON-LD uses those constants; root metadata uses the canonical description and brand constants; the About page now visibly identifies text2task.com as the official Text2Task product site without naming the founder; and tests lock the allowed company-only sameAs inventory and the absence of Person/founder schema. Production remains unchanged.</w:t>
+      </w:r>
+    </w:p>
+    <w:p>
+      <w:r>
+        <w:t xml:space="preserve"/>
+      </w:r>
+    </w:p>
+    <w:p>
+      <w:r>
+        <w:t xml:space="preserve">Phase 1 Milestone 2 production closeout update recorded 2026-09-14 18:08:27 Asia/Jerusalem: PR #4 was merged successfully to main as production merge commit 80b3318. Vercel Production reached READY. Owner manual Production smoke verification passed: Homepage loads correctly; About page loads correctly; the new "ABOUT TEXT2TASK" eyebrow is live; the new About opening paragraph is live; existing About photos remain; founder personal name is not published; no Person schema was intentionally added; no personal social/profile links were introduced; no visible regression was observed in the reviewed About sections; and the owner privacy decision remains preserved. Milestone 2 is now production deployed, production smoke verified, and complete. Milestone 3 has not started.</w:t>
       </w:r>
     </w:p>
     <w:p>
@@ -324,7 +339,12 @@
     </w:p>
     <w:p>
       <w:r>
-        <w:t xml:space="preserve">| Phase 1 Milestone 2 | IMPLEMENTED LOCALLY / AWAITING OWNER REVIEW |</w:t>
+        <w:t xml:space="preserve">| Phase 1 Milestone 2 | PRODUCTION DEPLOYED / PRODUCTION SMOKE VERIFIED / COMPLETE |</w:t>
+      </w:r>
+    </w:p>
+    <w:p>
+      <w:r>
+        <w:t xml:space="preserve">| Phase 1 Milestone 3 | NOT STARTED |</w:t>
       </w:r>
     </w:p>
     <w:p>
@@ -349,17 +369,17 @@
     </w:p>
     <w:p>
       <w:r>
-        <w:t xml:space="preserve">| Application code changed | YES — Phase 1 Milestone 1 implementation |</w:t>
-      </w:r>
-    </w:p>
-    <w:p>
-      <w:r>
-        <w:t xml:space="preserve">| Production changed | YES — PR #2 merged and Vercel Production deployed before this documentation closeout; this documentation task changed no Production configuration |</w:t>
-      </w:r>
-    </w:p>
-    <w:p>
-      <w:r>
-        <w:t xml:space="preserve">| Commit/push/deploy performed | PR #2 merge and automatic Vercel Production deployment already occurred; this documentation task creates/pushes docs branch only and performs no manual deploy |</w:t>
+        <w:t xml:space="preserve">| Application code changed | YES — Phase 1 Milestone 1 implementation and Phase 1 Milestone 2 implementation through merged PRs; this documentation closeout changed no application code |</w:t>
+      </w:r>
+    </w:p>
+    <w:p>
+      <w:r>
+        <w:t xml:space="preserve">| Production changed | YES — PR #2 and PR #4 were merged and Vercel Production deployed before their respective documentation closeouts; this documentation task changed no Production configuration |</w:t>
+      </w:r>
+    </w:p>
+    <w:p>
+      <w:r>
+        <w:t xml:space="preserve">| Commit/push/deploy performed | PR #4 merge and automatic Vercel Production deployment already occurred before this documentation closeout; this documentation task performs no commit, push, or deploy |</w:t>
       </w:r>
     </w:p>
     <w:p>
@@ -5849,12 +5869,17 @@
     </w:p>
     <w:p>
       <w:r>
-        <w:t xml:space="preserve"/>
-      </w:r>
-    </w:p>
-    <w:p>
-      <w:r>
-        <w:t xml:space="preserve">Phase 1 Milestone 1 changed application code and tests through PR #2. Phase 1 Milestone 2 now has local application/test/documentation changes on feat/seo-entity-disambiguation, awaiting owner review. Application code changed: YES — Phase 1 Milestone 1 plus local Phase 1 Milestone 2 implementation. Database changed: NO. Migration required: NO. Environment changed: NO. Vercel configuration changed by this task: NO. Production changed by this task: NO. Google configuration changed: NO. Bing application integration changed: NO. Manual deploy performed: NO.</w:t>
+        <w:t xml:space="preserve">| 2026-09-14 18:08:27 Asia/Jerusalem | Phase 1 Milestone 2 production closeout | PR #4 merge, Production deployment, and owner Production smoke verification recorded | Owner-supplied PR #4 merge/deployment facts and Production smoke-test report | Active run Markdown/DOCX, git branch/status/history only | Current run Markdown and DOCX only | PR #4 merged successfully; production merge commit 80b3318; Vercel Production READY; owner Production smoke test PASS for Homepage and About; new "ABOUT TEXT2TASK" eyebrow and opening paragraph verified live; existing About photos remain; founder personal name remains unpublished; Person schema remains intentionally absent; no personal-profile sameAs links introduced; no visible regression observed; privacy decision preserved | Git reconciliation confirmed local main fast-forwarded to origin/main at 80b3318; documentation-only branch used; no application/test/config/database/environment files changed by this task; no deploy performed by this task | Production deployed / production smoke verified / complete |</w:t>
+      </w:r>
+    </w:p>
+    <w:p>
+      <w:r>
+        <w:t xml:space="preserve"/>
+      </w:r>
+    </w:p>
+    <w:p>
+      <w:r>
+        <w:t xml:space="preserve">Phase 1 Milestone 1 changed application code and tests through PR #2. Phase 1 Milestone 2 changed application code, tests, and documentation through PR #4 and is now production deployed, production smoke verified, and complete. This closeout task changes documentation only. Application code changed by this documentation task: NO. Test files changed by this documentation task: NO. Database changed: NO. Migration required: NO. Environment changed: NO. Vercel configuration changed by this task: NO. Production changed by this task: NO. Google configuration changed: NO. Bing application integration changed: NO. Manual deploy performed: NO.</w:t>
       </w:r>
     </w:p>
     <w:p>
@@ -6238,7 +6263,12 @@
     </w:p>
     <w:p>
       <w:r>
-        <w:t xml:space="preserve">PHASE 1 MILESTONE 2: IMPLEMENTED LOCALLY / AWAITING OWNER REVIEW</w:t>
+        <w:t xml:space="preserve">PHASE 1 MILESTONE 2: PRODUCTION DEPLOYED / PRODUCTION SMOKE VERIFIED / COMPLETE</w:t>
+      </w:r>
+    </w:p>
+    <w:p>
+      <w:r>
+        <w:t xml:space="preserve">PHASE 1 MILESTONE 3: NOT STARTED</w:t>
       </w:r>
     </w:p>
     <w:p>
@@ -6258,17 +6288,17 @@
     </w:p>
     <w:p>
       <w:r>
-        <w:t xml:space="preserve">Phase 0B external baseline completion is complete / owner-reviewed. Phase 1 Milestone 1 is production deployed, production smoke verified, and complete. Milestone 2 is implemented locally and awaiting owner review. The owner has decided that founder identity remains private for now, so Milestone 2 implementation deliberately excludes founder name publication, Person schema, founder metadata, personal-profile sameAs, and personal social/profile links.</w:t>
-      </w:r>
-    </w:p>
-    <w:p>
-      <w:r>
-        <w:t xml:space="preserve"/>
-      </w:r>
-    </w:p>
-    <w:p>
-      <w:r>
-        <w:t xml:space="preserve">Application code changed: YES — Phase 1 Milestone 1 plus local Phase 1 Milestone 2 implementation. Database changed: NO. Environment changed: NO. Production changed by this task: NO. Google configuration changed: NO. Bing application integration changed: NO. Manual deploy performed: NO.</w:t>
+        <w:t xml:space="preserve">Phase 0B external baseline completion is complete / owner-reviewed. Phase 1 Milestone 1 is production deployed, production smoke verified, and complete. Milestone 2 is production deployed, production smoke verified, and complete. The owner privacy decision remains preserved: founder identity remains private for now, so Milestone 2 deliberately excludes founder name publication, Person schema, founder metadata, personal-profile sameAs, and personal social/profile links. Milestone 3 has not started.</w:t>
+      </w:r>
+    </w:p>
+    <w:p>
+      <w:r>
+        <w:t xml:space="preserve"/>
+      </w:r>
+    </w:p>
+    <w:p>
+      <w:r>
+        <w:t xml:space="preserve">Application code changed: YES — Phase 1 Milestone 1 and Phase 1 Milestone 2 implementation through merged PRs; this documentation task changed no application/test files. Database changed: NO. Environment changed: NO. Production changed by this documentation task: NO. Google configuration changed: NO. Bing application integration changed: NO. Manual deploy performed: NO.</w:t>
       </w:r>
     </w:p>
     <w:p>
@@ -6301,7 +6331,7 @@
     </w:p>
     <w:p>
       <w:r>
-        <w:t xml:space="preserve">Status: IMPLEMENTATION IN PROGRESS. Milestone 1 is complete and production deployed. Milestone 2 is implemented locally and awaiting owner review.</w:t>
+        <w:t xml:space="preserve">Status: IMPLEMENTATION IN PROGRESS. Milestone 1 is complete and production deployed. Milestone 2 is production deployed, production smoke verified, and complete. Milestone 3 has not started.</w:t>
       </w:r>
     </w:p>
     <w:p>
@@ -9974,7 +10004,7 @@
     </w:p>
     <w:p>
       <w:r>
-        <w:t xml:space="preserve">Current status after the Phase 1 Milestone 1 local implementation update</w:t>
+        <w:t xml:space="preserve">Current status after the Phase 1 Milestone 2 production closeout</w:t>
       </w:r>
     </w:p>
     <w:p>
@@ -9994,17 +10024,22 @@
     </w:p>
     <w:p>
       <w:r>
-        <w:t xml:space="preserve">- Phase 1 implementation: MILESTONE 1 PRODUCTION DEPLOYED / PRODUCTION SMOKE VERIFIED / COMPLETE.</w:t>
-      </w:r>
-    </w:p>
-    <w:p>
-      <w:r>
-        <w:t xml:space="preserve">- Milestone 2: IMPLEMENTED LOCALLY / AWAITING OWNER REVIEW.</w:t>
-      </w:r>
-    </w:p>
-    <w:p>
-      <w:r>
-        <w:t xml:space="preserve">- Application code changed: YES — Phase 1 Milestone 1 implementation.</w:t>
+        <w:t xml:space="preserve">- Phase 1 implementation: MILESTONE 1 COMPLETE; MILESTONE 2 PRODUCTION DEPLOYED / PRODUCTION SMOKE VERIFIED / COMPLETE.</w:t>
+      </w:r>
+    </w:p>
+    <w:p>
+      <w:r>
+        <w:t xml:space="preserve">- Milestone 2: PRODUCTION DEPLOYED / PRODUCTION SMOKE VERIFIED / COMPLETE.</w:t>
+      </w:r>
+    </w:p>
+    <w:p>
+      <w:r>
+        <w:t xml:space="preserve">- Milestone 3: NOT STARTED.</w:t>
+      </w:r>
+    </w:p>
+    <w:p>
+      <w:r>
+        <w:t xml:space="preserve">- Application code changed: YES — Phase 1 Milestone 1 and Phase 1 Milestone 2 implementation through merged PRs; this documentation task changed no application code.</w:t>
       </w:r>
     </w:p>
     <w:p>
@@ -10019,7 +10054,7 @@
     </w:p>
     <w:p>
       <w:r>
-        <w:t xml:space="preserve">- Production deployment: READY at merge commit b3e372c.</w:t>
+        <w:t xml:space="preserve">- Production deployment: READY at merge commit 80b3318 for Milestone 2.</w:t>
       </w:r>
     </w:p>
     <w:p>
@@ -11534,7 +11569,7 @@
     </w:p>
     <w:p>
       <w:r>
-        <w:t xml:space="preserve">Status: IMPLEMENTED LOCALLY / AWAITING OWNER REVIEW.</w:t>
+        <w:t xml:space="preserve">Status: PRODUCTION DEPLOYED / PRODUCTION SMOKE VERIFIED / COMPLETE.</w:t>
       </w:r>
     </w:p>
     <w:p>
@@ -12110,12 +12145,17 @@
     </w:p>
     <w:p>
       <w:r>
-        <w:t xml:space="preserve">- Milestone 2: IMPLEMENTED LOCALLY / AWAITING OWNER REVIEW.</w:t>
-      </w:r>
-    </w:p>
-    <w:p>
-      <w:r>
-        <w:t xml:space="preserve">- Production: UNCHANGED.</w:t>
+        <w:t xml:space="preserve">- Milestone 2: PRODUCTION DEPLOYED / PRODUCTION SMOKE VERIFIED / COMPLETE.</w:t>
+      </w:r>
+    </w:p>
+    <w:p>
+      <w:r>
+        <w:t xml:space="preserve">- Milestone 3: NOT STARTED.</w:t>
+      </w:r>
+    </w:p>
+    <w:p>
+      <w:r>
+        <w:t xml:space="preserve">- Production: Vercel Production READY; owner smoke verification PASS.</w:t>
       </w:r>
     </w:p>
     <w:p>
@@ -12135,17 +12175,155 @@
     </w:p>
     <w:p>
       <w:r>
-        <w:t xml:space="preserve">- Commit created: NO.</w:t>
-      </w:r>
-    </w:p>
-    <w:p>
-      <w:r>
-        <w:t xml:space="preserve">- Push performed: NO.</w:t>
-      </w:r>
-    </w:p>
-    <w:p>
-      <w:r>
-        <w:t xml:space="preserve">- Deploy performed: NO.</w:t>
+        <w:t xml:space="preserve">- Commit created by this documentation task: NO.</w:t>
+      </w:r>
+    </w:p>
+    <w:p>
+      <w:r>
+        <w:t xml:space="preserve">- Push performed by this documentation task: NO.</w:t>
+      </w:r>
+    </w:p>
+    <w:p>
+      <w:r>
+        <w:t xml:space="preserve">- Deploy performed by this documentation task: NO.</w:t>
+      </w:r>
+    </w:p>
+    <w:p>
+      <w:r>
+        <w:t xml:space="preserve"/>
+      </w:r>
+    </w:p>
+    <w:p>
+      <w:pPr>
+        <w:pStyle w:val="Heading2"/>
+      </w:pPr>
+      <w:r>
+        <w:t xml:space="preserve">42.8 Production Verification Closeout</w:t>
+      </w:r>
+    </w:p>
+    <w:p>
+      <w:r>
+        <w:t xml:space="preserve"/>
+      </w:r>
+    </w:p>
+    <w:p>
+      <w:r>
+        <w:t xml:space="preserve">Closeout timestamp: 2026-09-14 18:08:27 Asia/Jerusalem.</w:t>
+      </w:r>
+    </w:p>
+    <w:p>
+      <w:r>
+        <w:t xml:space="preserve"/>
+      </w:r>
+    </w:p>
+    <w:p>
+      <w:r>
+        <w:t xml:space="preserve">Production merge: PR #4 merged successfully to main.</w:t>
+      </w:r>
+    </w:p>
+    <w:p>
+      <w:r>
+        <w:t xml:space="preserve"/>
+      </w:r>
+    </w:p>
+    <w:p>
+      <w:r>
+        <w:t xml:space="preserve">Production merge commit: 80b3318.</w:t>
+      </w:r>
+    </w:p>
+    <w:p>
+      <w:r>
+        <w:t xml:space="preserve"/>
+      </w:r>
+    </w:p>
+    <w:p>
+      <w:r>
+        <w:t xml:space="preserve">Vercel Production status: READY.</w:t>
+      </w:r>
+    </w:p>
+    <w:p>
+      <w:r>
+        <w:t xml:space="preserve"/>
+      </w:r>
+    </w:p>
+    <w:p>
+      <w:r>
+        <w:t xml:space="preserve">Owner Production smoke verification: PASS.</w:t>
+      </w:r>
+    </w:p>
+    <w:p>
+      <w:r>
+        <w:t xml:space="preserve"/>
+      </w:r>
+    </w:p>
+    <w:p>
+      <w:r>
+        <w:t xml:space="preserve">Verified live in Production:</w:t>
+      </w:r>
+    </w:p>
+    <w:p>
+      <w:r>
+        <w:t xml:space="preserve"/>
+      </w:r>
+    </w:p>
+    <w:p>
+      <w:r>
+        <w:t xml:space="preserve">- Homepage loads correctly: PASS.</w:t>
+      </w:r>
+    </w:p>
+    <w:p>
+      <w:r>
+        <w:t xml:space="preserve">- About page loads correctly: PASS.</w:t>
+      </w:r>
+    </w:p>
+    <w:p>
+      <w:r>
+        <w:t xml:space="preserve">- New "ABOUT TEXT2TASK" eyebrow is live: PASS.</w:t>
+      </w:r>
+    </w:p>
+    <w:p>
+      <w:r>
+        <w:t xml:space="preserve">- New About opening paragraph is live: PASS.</w:t>
+      </w:r>
+    </w:p>
+    <w:p>
+      <w:r>
+        <w:t xml:space="preserve">- Existing About photos remain: PASS.</w:t>
+      </w:r>
+    </w:p>
+    <w:p>
+      <w:r>
+        <w:t xml:space="preserve">- Founder personal name is not published: PASS.</w:t>
+      </w:r>
+    </w:p>
+    <w:p>
+      <w:r>
+        <w:t xml:space="preserve">- Person schema remains intentionally absent: PASS.</w:t>
+      </w:r>
+    </w:p>
+    <w:p>
+      <w:r>
+        <w:t xml:space="preserve">- Personal social/profile links were not introduced: PASS.</w:t>
+      </w:r>
+    </w:p>
+    <w:p>
+      <w:r>
+        <w:t xml:space="preserve">- No visible regression observed in reviewed About sections: PASS.</w:t>
+      </w:r>
+    </w:p>
+    <w:p>
+      <w:r>
+        <w:t xml:space="preserve">- Owner privacy decision remains preserved: PASS.</w:t>
+      </w:r>
+    </w:p>
+    <w:p>
+      <w:r>
+        <w:t xml:space="preserve"/>
+      </w:r>
+    </w:p>
+    <w:p>
+      <w:r>
+        <w:t xml:space="preserve">No new Decision Log ID was created for this closeout because no new product or technical decision was made; this entry records deployment and production verification evidence only.</w:t>
       </w:r>
     </w:p>
     <w:sectPr>

</xml_diff>

<commit_message>
docs: record IndexNow production verification
</commit_message>
<xml_diff>
--- a/docs/seo-runs/2026-09-09/Text2Task_SEO_GEO_Run_2026-09-09.docx
+++ b/docs/seo-runs/2026-09-09/Text2Task_SEO_GEO_Run_2026-09-09.docx
@@ -91,7 +91,12 @@
     </w:p>
     <w:p>
       <w:r>
-        <w:t xml:space="preserve">**PHASE 1 MILESTONE 5: IMPLEMENTED LOCALLY / AWAITING OWNER REVIEW**</w:t>
+        <w:t xml:space="preserve">**PHASE 1 MILESTONE 5: PRODUCTION DEPLOYED / FIRST CONTROLLED SUBMISSION ACCEPTED / BING UI VERIFICATION PENDING**</w:t>
+      </w:r>
+    </w:p>
+    <w:p>
+      <w:r>
+        <w:t xml:space="preserve">**PHASE 1 MILESTONE 6: NOT STARTED**</w:t>
       </w:r>
     </w:p>
     <w:p>
@@ -342,6 +347,16 @@
     <w:p>
       <w:r>
         <w:t xml:space="preserve">Phase 1 Milestone 5 implementation update recorded 2026-09-15 16:49:12 Asia/Jerusalem: Bing / IndexNow Foundation was implemented locally on branch `feat/seo-indexnow-foundation` under Decision `SEO-2026-09-09-D025`. A new stable public IndexNow verification key was generated and committed-ready as a root `public/{key}.txt` verification file. A dry-run-first controlled CLI now derives eligibility from the existing sitemap/source architecture, validates canonical `https://www.text2task.com` URLs with allowlist-first plus denylist defense-in-depth, maps changed source files to candidate public URLs, refuses ambiguous/global changes without review, supports deleted/renamed candidates only as review-required, builds the official IndexNow POST body, and sends no external request unless `--submit` is explicitly provided and environment/canonical guards pass. No IndexNow request was sent, no Bing Webmaster Tools setting was changed, no database/environment/Vercel/Production change was made, and no commit/push/deploy was performed.</w:t>
+      </w:r>
+    </w:p>
+    <w:p>
+      <w:r>
+        <w:t xml:space="preserve"/>
+      </w:r>
+    </w:p>
+    <w:p>
+      <w:r>
+        <w:t xml:space="preserve">Phase 1 Milestone 5 production verification update recorded 2026-09-15 18:08:15 Asia/Jerusalem: PR #10 (`Phase 1: add Bing IndexNow foundation`) was merged successfully to `main`; implementation commit `8e63c0affe09ce3acb49e1da748e9b3c65b5799d` and merge commit `8e1adf480d78c385f6f7515b2b82c7090a10be97` are present on `main`; Vercel Production is READY. Owner manual Preview verification confirmed the public key file returned only the expected key and Preview build logs showed no automatic `npm run indexnow`, `--submit`, or `api.indexnow.org` execution. Owner manual Production verification confirmed the key file is live at `https://www.text2task.com/bfc07a49eb3f8529250cbcf7e23cce46febab912744d05dd172331de6fc230c6.txt` and returns only the expected public key. The first controlled real IndexNow submission sent exactly two approved canonical URLs, received HTTP 202 from `https://api.indexnow.org/indexnow`, and was classified by the implementation as `SUBMISSION_ACCEPTED` with retry count 0. Bing Webmaster Tools still showed the Get Started screen immediately afterward, so Bing UI propagation / verification remains pending. No duplicate resubmission was performed, no additional/private/Preview URL was submitted, no Bing setting was changed, and Milestone 5 is not complete yet.</w:t>
       </w:r>
     </w:p>
     <w:p>
@@ -444,7 +459,12 @@
     </w:p>
     <w:p>
       <w:r>
-        <w:t xml:space="preserve">| Phase 1 Milestone 5 | IMPLEMENTED LOCALLY / AWAITING OWNER REVIEW |</w:t>
+        <w:t xml:space="preserve">| Phase 1 Milestone 5 | PRODUCTION DEPLOYED / FIRST CONTROLLED SUBMISSION ACCEPTED / BING UI VERIFICATION PENDING |</w:t>
+      </w:r>
+    </w:p>
+    <w:p>
+      <w:r>
+        <w:t xml:space="preserve">| Phase 1 Milestone 6 | NOT STARTED |</w:t>
       </w:r>
     </w:p>
     <w:p>
@@ -474,12 +494,12 @@
     </w:p>
     <w:p>
       <w:r>
-        <w:t xml:space="preserve">| Production changed | YES — PR #2, PR #4, PR #6, PR #7, PR #8, and PR #9 were merged and Vercel Production deployed before this implementation task; this Milestone 5 implementation task changes no Production configuration |</w:t>
-      </w:r>
-    </w:p>
-    <w:p>
-      <w:r>
-        <w:t xml:space="preserve">| Commit/push/deploy performed | No commit, push, or deploy performed by this Milestone 5 implementation task |</w:t>
+        <w:t xml:space="preserve">| Production changed | YES — PR #2, PR #4, PR #6, PR #7, PR #8, PR #9, and PR #10 were merged and Vercel Production deployed before this documentation task; this documentation task changes no Production configuration |</w:t>
+      </w:r>
+    </w:p>
+    <w:p>
+      <w:r>
+        <w:t xml:space="preserve">| Commit/push/deploy performed | No commit, push, or deploy performed by this Milestone 5 documentation task |</w:t>
       </w:r>
     </w:p>
     <w:p>
@@ -567,7 +587,7 @@
     </w:p>
     <w:p>
       <w:r>
-        <w:t xml:space="preserve">8. **Bing Webmaster Tools onboarding is now configured/verified, with Bing data still processing**: Text2Task has been added to Bing Webmaster Tools as `text2task.com`; `https://www.text2task.com/sitemap.xml` was submitted successfully on 2026-09-13 and initially showed Processing. Initial 0 discovered URLs and no last crawl are expected at this stage and are not an indexing defect. IndexNow setup path was verified, but application implementation has not started. Bing AI Performance currently reports 0 citations and 0 cited pages for the selected 3-month period; do not claim Copilot has never mentioned Text2Task. Bing Backlinks shows data not yet available / pending processing; do not record this as 0 backlinks.</w:t>
+        <w:t xml:space="preserve">8. **Bing Webmaster Tools onboarding and IndexNow foundation are now configured/verified through the first controlled submission**: Text2Task has been added to Bing Webmaster Tools as `text2task.com`; `https://www.text2task.com/sitemap.xml` remains owner-verified as Success with 33 discovered URLs, 0 errors, 0 warnings, last submitted 2026-09-13, and last crawl 2026-09-13. PR #10 deployed the static public IndexNow key file and controlled dry-run-first CLI. The owner verified Preview no-submit safety and the live Production key file, then the first controlled real IndexNow submission sent exactly two approved canonical URLs and received HTTP 202 / `SUBMISSION_ACCEPTED`. This is not evidence of indexing, crawling, ranking, Bing visibility, or Copilot visibility. Bing Webmaster Tools IndexNow UI still showed Get Started immediately afterward, so Bing UI propagation / verification remains pending. Bing AI Performance currently reports 0 citations and 0 cited pages for the selected 3-month period; do not claim Copilot has never mentioned Text2Task. Bing Backlinks shows data not yet available / pending processing; do not record this as 0 backlinks.</w:t>
       </w:r>
     </w:p>
     <w:p>
@@ -6044,12 +6064,17 @@
     </w:p>
     <w:p>
       <w:r>
-        <w:t xml:space="preserve"/>
-      </w:r>
-    </w:p>
-    <w:p>
-      <w:r>
-        <w:t xml:space="preserve">Phase 1 Milestone 1 changed application code and tests through PR #2. Phase 1 Milestone 2 changed application code, tests, and documentation through PR #4. Phase 1 Milestone 3 changed application code, tests, and documentation through PR #6 and is now production deployed, production content verified, and complete. Phase 1 Milestone 4 changed application code, tests, and documentation through PR #8 and is now production deployed, production verified, and complete. Phase 1 Milestone 5 is implemented locally and awaiting owner review. **Milestone 5 added local IndexNow tooling, a public key file, tests, package script, and run documentation. Runtime application pages/routes changed by this task: NO. Database changed: NO. Migration required: NO. Environment changed: NO. Vercel configuration changed by this task: NO. Production changed by this implementation task: NO. Google configuration changed: NO. Bing Webmaster Tools setting changed: NO. IndexNow API called: NO. Manual deploy performed by this task: NO. Commit/push/deploy performed by this task: NO.**</w:t>
+        <w:t xml:space="preserve">| 2026-09-15 18:08:15 Asia/Jerusalem | Phase 1 Milestone 5 production verification | PR #10 merge, Preview key-file/no-submit verification, Production key-file verification, and first controlled IndexNow submission recorded | Owner-supplied PR #10 merge/deployment facts, owner Preview and Production key-file verification, owner Preview build-log verification, and first controlled IndexNow submission result | Active run Markdown/DOCX; git branch/status/history; committed IndexNow CLI dry-run/submission output | Current run Markdown and DOCX only | PR #10 merged successfully; implementation commit `8e63c0affe09ce3acb49e1da748e9b3c65b5799d` and merge commit `8e1adf480d78c385f6f7515b2b82c7090a10be97` present on main; Vercel Production READY; Preview key file returned only expected key; Preview build logs showed no automatic `npm run indexnow`, `--submit`, or `api.indexnow.org`; Production key file returned only expected key; first controlled IndexNow request submitted exactly `/solutions/freelancer-project-management-software` and `/features/email-to-tasks`; endpoint returned HTTP 202 and implementation classified `SUBMISSION_ACCEPTED`; retry count 0; elapsed time 1069 ms | Dry-run candidate count 2, accepted count 2, rejected count 0, canonical host `www.text2task.com`, keyLocation exact; no additional URL, Preview URL, private URL, homepage URL, key-file URL, all-site URL, deleted URL, or redirect URL submitted; Bing Webmaster Tools IndexNow still showed Get Started immediately afterward, so Bing UI propagation / verification remains pending; no duplicate resubmission performed | Production deployed / first controlled submission accepted / Bing UI verification pending |</w:t>
+      </w:r>
+    </w:p>
+    <w:p>
+      <w:r>
+        <w:t xml:space="preserve"/>
+      </w:r>
+    </w:p>
+    <w:p>
+      <w:r>
+        <w:t xml:space="preserve">Phase 1 Milestone 1 changed application code and tests through PR #2. Phase 1 Milestone 2 changed application code, tests, and documentation through PR #4. Phase 1 Milestone 3 changed application code, tests, and documentation through PR #6 and is now production deployed, production content verified, and complete. Phase 1 Milestone 4 changed application code, tests, and documentation through PR #8 and is now production deployed, production verified, and complete. Phase 1 Milestone 5 is production deployed with the first controlled IndexNow submission accepted, and Bing UI verification pending. **Milestone 5 added local IndexNow tooling, a public key file, tests, package script, and run documentation through PR #10. This documentation task changed only the current run Markdown/DOCX. Runtime application pages/routes changed by this task: NO. Database changed: NO. Migration required: NO. Environment changed: NO. Vercel configuration changed by this task: NO. Production application changed by this documentation task: NO. Google configuration changed: NO. Bing Webmaster Tools setting changed: NO. Duplicate IndexNow resubmission performed by this task: NO. Manual deploy performed by this task: NO. Commit/push/deploy performed by this task: NO.**</w:t>
       </w:r>
     </w:p>
     <w:p>
@@ -6648,7 +6673,12 @@
     </w:p>
     <w:p>
       <w:r>
-        <w:t xml:space="preserve">**PHASE 1 MILESTONE 5: MAPPING / IMPLEMENTATION PLAN READY**</w:t>
+        <w:t xml:space="preserve">**PHASE 1 MILESTONE 5: PRODUCTION DEPLOYED / FIRST CONTROLLED SUBMISSION ACCEPTED / BING UI VERIFICATION PENDING**</w:t>
+      </w:r>
+    </w:p>
+    <w:p>
+      <w:r>
+        <w:t xml:space="preserve">**PHASE 1 MILESTONE 6: NOT STARTED**</w:t>
       </w:r>
     </w:p>
     <w:p>
@@ -6668,17 +6698,17 @@
     </w:p>
     <w:p>
       <w:r>
-        <w:t xml:space="preserve">Phase 0B external baseline completion is complete / owner-reviewed. Phase 1 Milestone 1 is complete. Milestone 2 is complete. Milestone 3 is complete. Milestone 4 is complete. Milestone 5 mapping / implementation planning is ready for owner review. The owner privacy decision remains preserved: founder identity remains private for now, so Milestone 2 deliberately excludes founder name publication, `Person` schema, founder metadata, personal-profile `sameAs`, and personal social/profile links.</w:t>
-      </w:r>
-    </w:p>
-    <w:p>
-      <w:r>
-        <w:t xml:space="preserve"/>
-      </w:r>
-    </w:p>
-    <w:p>
-      <w:r>
-        <w:t xml:space="preserve">**Application code changed: YES — Phase 1 Milestones 1, 2, 3, and 4 changed application code through merged PRs; this Milestone 5 mapping task changed no application/test files. Database changed: NO. Environment changed: NO. Production changed by this mapping task: NO. Google configuration changed: NO. Bing application integration changed: NO. IndexNow API called: NO. Manual deploy performed by this task: NO. Commit/push/deploy performed by this task: NO.**</w:t>
+        <w:t xml:space="preserve">Phase 0B external baseline completion is complete / owner-reviewed. Phase 1 Milestone 1 is complete. Milestone 2 is complete. Milestone 3 is complete. Milestone 4 is complete. Milestone 5 is production deployed with the first controlled IndexNow submission accepted, and Bing UI verification pending. Milestone 6 has not started. The owner privacy decision remains preserved: founder identity remains private for now, so Milestone 2 deliberately excludes founder name publication, `Person` schema, founder metadata, personal-profile `sameAs`, and personal social/profile links.</w:t>
+      </w:r>
+    </w:p>
+    <w:p>
+      <w:r>
+        <w:t xml:space="preserve"/>
+      </w:r>
+    </w:p>
+    <w:p>
+      <w:r>
+        <w:t xml:space="preserve">**Application code changed: YES â€” Phase 1 Milestones 1, 2, 3, 4, and 5 changed application/repository behavior through merged PRs; this documentation task changed no application/test/IndexNow implementation files. Database changed: NO. Environment changed: NO. Production application changed by this documentation task: NO. Google configuration changed: NO. Bing Webmaster Tools setting changed: NO. First controlled IndexNow API request was accepted with HTTP 202; Bing UI verification remains pending. Manual deploy performed by this task: NO. Commit/push/deploy performed by this task: NO.**</w:t>
       </w:r>
     </w:p>
     <w:p>
@@ -10384,7 +10414,7 @@
     </w:p>
     <w:p>
       <w:r>
-        <w:t xml:space="preserve">**Current status after the Phase 1 Milestone 5 implementation update**</w:t>
+        <w:t xml:space="preserve">**Current status after the Phase 1 Milestone 5 production verification update**</w:t>
       </w:r>
     </w:p>
     <w:p>
@@ -10404,7 +10434,7 @@
     </w:p>
     <w:p>
       <w:r>
-        <w:t xml:space="preserve">- Phase 1 implementation: MILESTONE 1 COMPLETE; MILESTONE 2 COMPLETE; MILESTONE 3 COMPLETE; MILESTONE 4 COMPLETE; MILESTONE 5 IMPLEMENTED LOCALLY / AWAITING OWNER REVIEW.</w:t>
+        <w:t xml:space="preserve">- Phase 1 implementation: MILESTONE 1 COMPLETE; MILESTONE 2 COMPLETE; MILESTONE 3 COMPLETE; MILESTONE 4 COMPLETE; MILESTONE 5 PRODUCTION DEPLOYED / FIRST CONTROLLED SUBMISSION ACCEPTED / BING UI VERIFICATION PENDING.</w:t>
       </w:r>
     </w:p>
     <w:p>
@@ -10424,12 +10454,22 @@
     </w:p>
     <w:p>
       <w:r>
-        <w:t xml:space="preserve">- Milestone 5: IMPLEMENTED LOCALLY / AWAITING OWNER REVIEW.</w:t>
-      </w:r>
-    </w:p>
-    <w:p>
-      <w:r>
-        <w:t xml:space="preserve">- Application code changed: YES - Phase 1 Milestones 1, 2, 3, and 4 changed application code through merged PRs; this Milestone 5 implementation task added local IndexNow tooling, a public key file, tests, package script, and run documentation but did not change runtime application pages/routes.</w:t>
+        <w:t xml:space="preserve">- Milestone 5: PRODUCTION DEPLOYED / FIRST CONTROLLED SUBMISSION ACCEPTED / BING UI VERIFICATION PENDING.</w:t>
+      </w:r>
+    </w:p>
+    <w:p>
+      <w:r>
+        <w:t xml:space="preserve">- Milestone 6: NOT STARTED.</w:t>
+      </w:r>
+    </w:p>
+    <w:p>
+      <w:r>
+        <w:t xml:space="preserve">- Remaining Milestone 5 closure gate: Bing Webmaster Tools IndexNow post-submission verification.</w:t>
+      </w:r>
+    </w:p>
+    <w:p>
+      <w:r>
+        <w:t xml:space="preserve">- Application code changed: YES - Phase 1 Milestones 1, 2, 3, 4, and 5 changed application/repository behavior through merged PRs; this Milestone 5 documentation task changed no application/test/IndexNow implementation files.</w:t>
       </w:r>
     </w:p>
     <w:p>
@@ -10444,17 +10484,27 @@
     </w:p>
     <w:p>
       <w:r>
-        <w:t xml:space="preserve">- Production deployment: READY at merge commit `faebce0094f2cc4d5ba4e663bdaa7a127bd15533` for Milestone 4.</w:t>
-      </w:r>
-    </w:p>
-    <w:p>
-      <w:r>
-        <w:t xml:space="preserve">- Production route/content verification: PASS.</w:t>
-      </w:r>
-    </w:p>
-    <w:p>
-      <w:r>
-        <w:t xml:space="preserve">- Production changed by this implementation task: NO.</w:t>
+        <w:t xml:space="preserve">- Production deployment: READY at merge commit `8e1adf480d78c385f6f7515b2b82c7090a10be97` for Milestone 5.</w:t>
+      </w:r>
+    </w:p>
+    <w:p>
+      <w:r>
+        <w:t xml:space="preserve">- Production key-file verification: PASS.</w:t>
+      </w:r>
+    </w:p>
+    <w:p>
+      <w:r>
+        <w:t xml:space="preserve">- First controlled IndexNow submission: HTTP 202 / `SUBMISSION_ACCEPTED`.</w:t>
+      </w:r>
+    </w:p>
+    <w:p>
+      <w:r>
+        <w:t xml:space="preserve">- Bing UI propagation / verification: PENDING.</w:t>
+      </w:r>
+    </w:p>
+    <w:p>
+      <w:r>
+        <w:t xml:space="preserve">- Production application changed by this documentation task: NO.</w:t>
       </w:r>
     </w:p>
     <w:p>
@@ -16848,7 +16898,7 @@
     </w:p>
     <w:p>
       <w:r>
-        <w:t xml:space="preserve">**Status:** IMPLEMENTED LOCALLY / AWAITING OWNER REVIEW.</w:t>
+        <w:t xml:space="preserve">**Status:** PRODUCTION DEPLOYED / FIRST CONTROLLED SUBMISSION ACCEPTED / BING UI VERIFICATION PENDING.</w:t>
       </w:r>
     </w:p>
     <w:p>
@@ -17117,7 +17167,7 @@
     </w:p>
     <w:p>
       <w:r>
-        <w:t xml:space="preserve">Future Production verification URL after deployment:</w:t>
+        <w:t xml:space="preserve">Production verification URL:</w:t>
       </w:r>
     </w:p>
     <w:p>
@@ -17137,7 +17187,7 @@
     </w:p>
     <w:p>
       <w:r>
-        <w:t xml:space="preserve">The key file contains only the key text. It is public protocol verification material, not an application secret.</w:t>
+        <w:t xml:space="preserve">The owner manually verified that the Production URL returns only the expected public IndexNow key. The key file contains only the key text. It is public protocol verification material, not an application secret.</w:t>
       </w:r>
     </w:p>
     <w:p>
@@ -17336,17 +17386,7 @@
         <w:pStyle w:val="Heading3"/>
       </w:pPr>
       <w:r>
-        <w:t xml:space="preserve">50.6 Submission Policy</w:t>
-      </w:r>
-    </w:p>
-    <w:p>
-      <w:r>
-        <w:t xml:space="preserve"/>
-      </w:r>
-    </w:p>
-    <w:p>
-      <w:r>
-        <w:t xml:space="preserve">No real IndexNow request was sent during local implementation.</w:t>
+        <w:t xml:space="preserve">50.6 Submission Policy and First Controlled Submission</w:t>
       </w:r>
     </w:p>
     <w:p>
@@ -17386,12 +17426,47 @@
     </w:p>
     <w:p>
       <w:r>
-        <w:t xml:space="preserve">- The first controlled Production submission set is not approved yet.</w:t>
+        <w:t xml:space="preserve">- No all-site submission is allowed without explicit review.</w:t>
       </w:r>
     </w:p>
     <w:p>
       <w:r>
         <w:t xml:space="preserve">- CI/deployment automation is deferred.</w:t>
+      </w:r>
+    </w:p>
+    <w:p>
+      <w:r>
+        <w:t xml:space="preserve"/>
+      </w:r>
+    </w:p>
+    <w:p>
+      <w:r>
+        <w:t xml:space="preserve">After PR #10 was merged and Vercel Production reached READY, the owner manually verified the Production key file and approved the first controlled submission set. The first controlled real IndexNow submission sent exactly:</w:t>
+      </w:r>
+    </w:p>
+    <w:p>
+      <w:r>
+        <w:t xml:space="preserve"/>
+      </w:r>
+    </w:p>
+    <w:p>
+      <w:r>
+        <w:t xml:space="preserve">- `https://www.text2task.com/solutions/freelancer-project-management-software`.</w:t>
+      </w:r>
+    </w:p>
+    <w:p>
+      <w:r>
+        <w:t xml:space="preserve">- `https://www.text2task.com/features/email-to-tasks`.</w:t>
+      </w:r>
+    </w:p>
+    <w:p>
+      <w:r>
+        <w:t xml:space="preserve"/>
+      </w:r>
+    </w:p>
+    <w:p>
+      <w:r>
+        <w:t xml:space="preserve">No homepage URL, key-file URL, Preview URL, private URL, deleted URL, redirect URL, or additional sitemap URL was submitted.</w:t>
       </w:r>
     </w:p>
     <w:p>
@@ -17517,72 +17592,212 @@
         <w:pStyle w:val="Heading3"/>
       </w:pPr>
       <w:r>
-        <w:t xml:space="preserve">50.8 Deferred Production Verification</w:t>
-      </w:r>
-    </w:p>
-    <w:p>
-      <w:r>
-        <w:t xml:space="preserve"/>
-      </w:r>
-    </w:p>
-    <w:p>
-      <w:r>
-        <w:t xml:space="preserve">After owner review, PR approval, merge, and Vercel Production READY, the Production verification gate should:</w:t>
-      </w:r>
-    </w:p>
-    <w:p>
-      <w:r>
-        <w:t xml:space="preserve"/>
-      </w:r>
-    </w:p>
-    <w:p>
-      <w:r>
-        <w:t xml:space="preserve">1. Fetch the public key file from `https://www.text2task.com/bfc07a49eb3f8529250cbcf7e23cce46febab912744d05dd172331de6fc230c6.txt`.</w:t>
-      </w:r>
-    </w:p>
-    <w:p>
-      <w:r>
-        <w:t xml:space="preserve">2. Confirm the response body contains exactly the key.</w:t>
-      </w:r>
-    </w:p>
-    <w:p>
-      <w:r>
-        <w:t xml:space="preserve">3. Run a dry-run for the owner-approved first URL set.</w:t>
-      </w:r>
-    </w:p>
-    <w:p>
-      <w:r>
-        <w:t xml:space="preserve">4. Submit only the owner-approved small canonical URL set with `--submit`.</w:t>
-      </w:r>
-    </w:p>
-    <w:p>
-      <w:r>
-        <w:t xml:space="preserve">5. Record the endpoint response.</w:t>
-      </w:r>
-    </w:p>
-    <w:p>
-      <w:r>
-        <w:t xml:space="preserve">6. Verify Bing Webmaster Tools IndexNow reporting/status where available.</w:t>
-      </w:r>
-    </w:p>
-    <w:p>
-      <w:r>
-        <w:t xml:space="preserve">7. Confirm sitemap remains healthy.</w:t>
-      </w:r>
-    </w:p>
-    <w:p>
-      <w:r>
-        <w:t xml:space="preserve">8. Document the Production outcome.</w:t>
-      </w:r>
-    </w:p>
-    <w:p>
-      <w:r>
-        <w:t xml:space="preserve"/>
-      </w:r>
-    </w:p>
-    <w:p>
-      <w:r>
-        <w:t xml:space="preserve">Do not submit all 33 sitemap URLs blindly.</w:t>
+        <w:t xml:space="preserve">50.8 Production Verification and IndexNow Response</w:t>
+      </w:r>
+    </w:p>
+    <w:p>
+      <w:r>
+        <w:t xml:space="preserve"/>
+      </w:r>
+    </w:p>
+    <w:p>
+      <w:r>
+        <w:t xml:space="preserve">Production verification recorded 2026-09-15 18:08:15 Asia/Jerusalem:</w:t>
+      </w:r>
+    </w:p>
+    <w:p>
+      <w:r>
+        <w:t xml:space="preserve"/>
+      </w:r>
+    </w:p>
+    <w:p>
+      <w:r>
+        <w:t xml:space="preserve">- PR #10 (`Phase 1: add Bing IndexNow foundation`) merged successfully.</w:t>
+      </w:r>
+    </w:p>
+    <w:p>
+      <w:r>
+        <w:t xml:space="preserve">- Implementation commit: `8e63c0affe09ce3acb49e1da748e9b3c65b5799d`.</w:t>
+      </w:r>
+    </w:p>
+    <w:p>
+      <w:r>
+        <w:t xml:space="preserve">- Merge commit: `8e1adf480d78c385f6f7515b2b82c7090a10be97`.</w:t>
+      </w:r>
+    </w:p>
+    <w:p>
+      <w:r>
+        <w:t xml:space="preserve">- Vercel Production: READY.</w:t>
+      </w:r>
+    </w:p>
+    <w:p>
+      <w:r>
+        <w:t xml:space="preserve">- Preview key-file verification: PASS.</w:t>
+      </w:r>
+    </w:p>
+    <w:p>
+      <w:r>
+        <w:t xml:space="preserve">- Preview no-submit verification: PASS; Preview build logs showed no automatic `npm run indexnow`, no `--submit`, and no `api.indexnow.org` request.</w:t>
+      </w:r>
+    </w:p>
+    <w:p>
+      <w:r>
+        <w:t xml:space="preserve">- Production key-file verification: PASS.</w:t>
+      </w:r>
+    </w:p>
+    <w:p>
+      <w:r>
+        <w:t xml:space="preserve">- Dry-run candidate count: 2.</w:t>
+      </w:r>
+    </w:p>
+    <w:p>
+      <w:r>
+        <w:t xml:space="preserve">- Dry-run accepted count: 2.</w:t>
+      </w:r>
+    </w:p>
+    <w:p>
+      <w:r>
+        <w:t xml:space="preserve">- Dry-run rejected count: 0.</w:t>
+      </w:r>
+    </w:p>
+    <w:p>
+      <w:r>
+        <w:t xml:space="preserve">- Dry-run canonical host: `www.text2task.com`.</w:t>
+      </w:r>
+    </w:p>
+    <w:p>
+      <w:r>
+        <w:t xml:space="preserve">- Dry-run keyLocation: `https://www.text2task.com/bfc07a49eb3f8529250cbcf7e23cce46febab912744d05dd172331de6fc230c6.txt`.</w:t>
+      </w:r>
+    </w:p>
+    <w:p>
+      <w:r>
+        <w:t xml:space="preserve">- Endpoint: `https://api.indexnow.org/indexnow`.</w:t>
+      </w:r>
+    </w:p>
+    <w:p>
+      <w:r>
+        <w:t xml:space="preserve">- HTTP response status: 202.</w:t>
+      </w:r>
+    </w:p>
+    <w:p>
+      <w:r>
+        <w:t xml:space="preserve">- Implementation classification: `SUBMISSION_ACCEPTED`.</w:t>
+      </w:r>
+    </w:p>
+    <w:p>
+      <w:r>
+        <w:t xml:space="preserve">- Submitted URL count: 2.</w:t>
+      </w:r>
+    </w:p>
+    <w:p>
+      <w:r>
+        <w:t xml:space="preserve">- Retry count: 0.</w:t>
+      </w:r>
+    </w:p>
+    <w:p>
+      <w:r>
+        <w:t xml:space="preserve">- Elapsed time: 1069 ms.</w:t>
+      </w:r>
+    </w:p>
+    <w:p>
+      <w:r>
+        <w:t xml:space="preserve">- Additional URL submitted: NO.</w:t>
+      </w:r>
+    </w:p>
+    <w:p>
+      <w:r>
+        <w:t xml:space="preserve">- Preview URL submitted: NO.</w:t>
+      </w:r>
+    </w:p>
+    <w:p>
+      <w:r>
+        <w:t xml:space="preserve">- Private URL submitted: NO.</w:t>
+      </w:r>
+    </w:p>
+    <w:p>
+      <w:r>
+        <w:t xml:space="preserve">- All-site submission: NO.</w:t>
+      </w:r>
+    </w:p>
+    <w:p>
+      <w:r>
+        <w:t xml:space="preserve">- Duplicate resubmission: NO.</w:t>
+      </w:r>
+    </w:p>
+    <w:p>
+      <w:r>
+        <w:t xml:space="preserve"/>
+      </w:r>
+    </w:p>
+    <w:p>
+      <w:r>
+        <w:t xml:space="preserve">HTTP 202 is recorded conservatively as endpoint acceptance for further processing. It is not evidence that the submitted URLs are indexed, crawled, ranking, visible in Bing, visible in Copilot, or guaranteed to enter the search index.</w:t>
+      </w:r>
+    </w:p>
+    <w:p>
+      <w:r>
+        <w:t xml:space="preserve"/>
+      </w:r>
+    </w:p>
+    <w:p>
+      <w:r>
+        <w:t xml:space="preserve">Immediately after the accepted submission, the owner manually checked Bing Webmaster Tools -&gt; IndexNow. The Bing UI still showed the Get Started screen and no submission dashboard was visible yet. This is classified as **BING UI PROPAGATION / VERIFICATION PENDING**, not as a submission failure. Do not resubmit the same two URLs merely because the Bing UI has not updated yet.</w:t>
+      </w:r>
+    </w:p>
+    <w:p>
+      <w:r>
+        <w:t xml:space="preserve"/>
+      </w:r>
+    </w:p>
+    <w:p>
+      <w:r>
+        <w:t xml:space="preserve">The current Bing sitemap baseline remains:</w:t>
+      </w:r>
+    </w:p>
+    <w:p>
+      <w:r>
+        <w:t xml:space="preserve"/>
+      </w:r>
+    </w:p>
+    <w:p>
+      <w:r>
+        <w:t xml:space="preserve">- Sitemap: `https://www.text2task.com/sitemap.xml`.</w:t>
+      </w:r>
+    </w:p>
+    <w:p>
+      <w:r>
+        <w:t xml:space="preserve">- Status: Success.</w:t>
+      </w:r>
+    </w:p>
+    <w:p>
+      <w:r>
+        <w:t xml:space="preserve">- Known sitemaps: 1.</w:t>
+      </w:r>
+    </w:p>
+    <w:p>
+      <w:r>
+        <w:t xml:space="preserve">- Errors: 0.</w:t>
+      </w:r>
+    </w:p>
+    <w:p>
+      <w:r>
+        <w:t xml:space="preserve">- Warnings: 0.</w:t>
+      </w:r>
+    </w:p>
+    <w:p>
+      <w:r>
+        <w:t xml:space="preserve">- URLs discovered: 33.</w:t>
+      </w:r>
+    </w:p>
+    <w:p>
+      <w:r>
+        <w:t xml:space="preserve">- Last submit shown by Bing: 2026-09-13.</w:t>
+      </w:r>
+    </w:p>
+    <w:p>
+      <w:r>
+        <w:t xml:space="preserve">- Last crawl shown by Bing: 2026-09-13.</w:t>
       </w:r>
     </w:p>
     <w:p>
@@ -17595,7 +17810,7 @@
         <w:pStyle w:val="Heading3"/>
       </w:pPr>
       <w:r>
-        <w:t xml:space="preserve">50.9 Final Milestone 5 Local State</w:t>
+        <w:t xml:space="preserve">50.9 Current Milestone 5 Production State</w:t>
       </w:r>
     </w:p>
     <w:p>
@@ -17635,7 +17850,17 @@
     </w:p>
     <w:p>
       <w:r>
-        <w:t xml:space="preserve">- Milestone 5: IMPLEMENTED LOCALLY / AWAITING OWNER REVIEW.</w:t>
+        <w:t xml:space="preserve">- Milestone 5: PRODUCTION DEPLOYED / FIRST CONTROLLED SUBMISSION ACCEPTED / BING UI VERIFICATION PENDING.</w:t>
+      </w:r>
+    </w:p>
+    <w:p>
+      <w:r>
+        <w:t xml:space="preserve">- Milestone 6: NOT STARTED.</w:t>
+      </w:r>
+    </w:p>
+    <w:p>
+      <w:r>
+        <w:t xml:space="preserve">- Remaining Milestone 5 closure gate: Bing Webmaster Tools IndexNow post-submission verification.</w:t>
       </w:r>
     </w:p>
     <w:p>
@@ -17670,12 +17895,12 @@
     </w:p>
     <w:p>
       <w:r>
-        <w:t xml:space="preserve">- Bing Webmaster Tools changed: NO.</w:t>
-      </w:r>
-    </w:p>
-    <w:p>
-      <w:r>
-        <w:t xml:space="preserve">- IndexNow API request sent: NO.</w:t>
+        <w:t xml:space="preserve">- Bing Webmaster Tools settings changed: NO.</w:t>
+      </w:r>
+    </w:p>
+    <w:p>
+      <w:r>
+        <w:t xml:space="preserve">- IndexNow API request sent: YES - exactly the two owner-approved canonical URLs above.</w:t>
       </w:r>
     </w:p>
     <w:p>
@@ -17695,17 +17920,17 @@
     </w:p>
     <w:p>
       <w:r>
-        <w:t xml:space="preserve">- Production changed: NO.</w:t>
-      </w:r>
-    </w:p>
-    <w:p>
-      <w:r>
-        <w:t xml:space="preserve"/>
-      </w:r>
-    </w:p>
-    <w:p>
-      <w:r>
-        <w:t xml:space="preserve">No new Decision Log ID was created because this mapping task records analysis and recommendations only. The owner still needs to approve the implementation boundary and P0/P1 direction before Milestone 4 implementation begins.</w:t>
+        <w:t xml:space="preserve">- Production application changed by this documentation task: NO.</w:t>
+      </w:r>
+    </w:p>
+    <w:p>
+      <w:r>
+        <w:t xml:space="preserve"/>
+      </w:r>
+    </w:p>
+    <w:p>
+      <w:r>
+        <w:t xml:space="preserve">No new Decision Log ID was created for this production verification documentation task because no new architecture or product decision was made. Decision `SEO-2026-09-09-D025` remains the controlling Milestone 5 decision.</w:t>
       </w:r>
     </w:p>
     <w:p>

</xml_diff>